<commit_message>
feat: replace document preview libs with @silurus/ooxml WASM renderer
- Replace docx-preview, pptx-viewer, xlsx, xlsx-preview with @silurus/ooxml
- Unify all document viewers (DOCX/PPTX/XLSX) to canvas-based rendering
- Refactor PDF viewer from single-page pagination to full-page scroll with TextLayer
- Add zoom controls to DOCX and PPTX viewers for consistent UX
- Add vite-plugin-wasm for WASM module support
- Remove ~15 transitive dependencies, reducing bundle size
- Minor formatting fix in mcp-search-schema.ts
- Bump version to 0.1.38
</commit_message>
<xml_diff>
--- a/example-files/sample.docx
+++ b/example-files/sample.docx
@@ -253,6 +253,183 @@
         </w:tc>
       </w:tr>
     </w:tbl>
+    <w:p>
+      <w:r>
+        <w:br w:type="page"/>
+      </w:r>
+    </w:p>
+    <w:p>
+      <w:r>
+        <w:rPr>
+          <w:b/>
+          <w:sz w:val="48"/>
+        </w:rPr>
+        <w:t>Page 2</w:t>
+      </w:r>
+    </w:p>
+    <w:p>
+      <w:r>
+        <w:t>This is paragraph 1 on page 2. Lorem ipsum dolor sit amet, consectetur adipiscing elit. Sed do eiusmod tempor incididunt ut labore et dolore magna aliqua. Ut enim ad minim veniam, quis nostrud exercitation ullamco laboris nisi ut aliquip ex ea commodo consequat.</w:t>
+      </w:r>
+    </w:p>
+    <w:p>
+      <w:r>
+        <w:t>This is paragraph 2 on page 2. Lorem ipsum dolor sit amet, consectetur adipiscing elit. Sed do eiusmod tempor incididunt ut labore et dolore magna aliqua. Ut enim ad minim veniam, quis nostrud exercitation ullamco laboris nisi ut aliquip ex ea commodo consequat.</w:t>
+      </w:r>
+    </w:p>
+    <w:p>
+      <w:r>
+        <w:t>This is paragraph 3 on page 2. Lorem ipsum dolor sit amet, consectetur adipiscing elit. Sed do eiusmod tempor incididunt ut labore et dolore magna aliqua. Ut enim ad minim veniam, quis nostrud exercitation ullamco laboris nisi ut aliquip ex ea commodo consequat.</w:t>
+      </w:r>
+    </w:p>
+    <w:p>
+      <w:r>
+        <w:t>This is paragraph 4 on page 2. Lorem ipsum dolor sit amet, consectetur adipiscing elit. Sed do eiusmod tempor incididunt ut labore et dolore magna aliqua. Ut enim ad minim veniam, quis nostrud exercitation ullamco laboris nisi ut aliquip ex ea commodo consequat.</w:t>
+      </w:r>
+    </w:p>
+    <w:p>
+      <w:r>
+        <w:t>This is paragraph 5 on page 2. Lorem ipsum dolor sit amet, consectetur adipiscing elit. Sed do eiusmod tempor incididunt ut labore et dolore magna aliqua. Ut enim ad minim veniam, quis nostrud exercitation ullamco laboris nisi ut aliquip ex ea commodo consequat.</w:t>
+      </w:r>
+    </w:p>
+    <w:p>
+      <w:r>
+        <w:t>This is paragraph 6 on page 2. Lorem ipsum dolor sit amet, consectetur adipiscing elit. Sed do eiusmod tempor incididunt ut labore et dolore magna aliqua. Ut enim ad minim veniam, quis nostrud exercitation ullamco laboris nisi ut aliquip ex ea commodo consequat.</w:t>
+      </w:r>
+    </w:p>
+    <w:p>
+      <w:r>
+        <w:t>This is paragraph 7 on page 2. Lorem ipsum dolor sit amet, consectetur adipiscing elit. Sed do eiusmod tempor incididunt ut labore et dolore magna aliqua. Ut enim ad minim veniam, quis nostrud exercitation ullamco laboris nisi ut aliquip ex ea commodo consequat.</w:t>
+      </w:r>
+    </w:p>
+    <w:p>
+      <w:r>
+        <w:t>This is paragraph 8 on page 2. Lorem ipsum dolor sit amet, consectetur adipiscing elit. Sed do eiusmod tempor incididunt ut labore et dolore magna aliqua. Ut enim ad minim veniam, quis nostrud exercitation ullamco laboris nisi ut aliquip ex ea commodo consequat.</w:t>
+      </w:r>
+    </w:p>
+    <w:p>
+      <w:r>
+        <w:t>This is paragraph 9 on page 2. Lorem ipsum dolor sit amet, consectetur adipiscing elit. Sed do eiusmod tempor incididunt ut labore et dolore magna aliqua. Ut enim ad minim veniam, quis nostrud exercitation ullamco laboris nisi ut aliquip ex ea commodo consequat.</w:t>
+      </w:r>
+    </w:p>
+    <w:p>
+      <w:r>
+        <w:br w:type="page"/>
+      </w:r>
+    </w:p>
+    <w:p>
+      <w:r>
+        <w:rPr>
+          <w:b/>
+          <w:sz w:val="48"/>
+        </w:rPr>
+        <w:t>Page 3</w:t>
+      </w:r>
+    </w:p>
+    <w:p>
+      <w:r>
+        <w:t>This is paragraph 1 on page 3. Lorem ipsum dolor sit amet, consectetur adipiscing elit. Sed do eiusmod tempor incididunt ut labore et dolore magna aliqua. Ut enim ad minim veniam, quis nostrud exercitation ullamco laboris nisi ut aliquip ex ea commodo consequat.</w:t>
+      </w:r>
+    </w:p>
+    <w:p>
+      <w:r>
+        <w:t>This is paragraph 2 on page 3. Lorem ipsum dolor sit amet, consectetur adipiscing elit. Sed do eiusmod tempor incididunt ut labore et dolore magna aliqua. Ut enim ad minim veniam, quis nostrud exercitation ullamco laboris nisi ut aliquip ex ea commodo consequat.</w:t>
+      </w:r>
+    </w:p>
+    <w:p>
+      <w:r>
+        <w:t>This is paragraph 3 on page 3. Lorem ipsum dolor sit amet, consectetur adipiscing elit. Sed do eiusmod tempor incididunt ut labore et dolore magna aliqua. Ut enim ad minim veniam, quis nostrud exercitation ullamco laboris nisi ut aliquip ex ea commodo consequat.</w:t>
+      </w:r>
+    </w:p>
+    <w:p>
+      <w:r>
+        <w:t>This is paragraph 4 on page 3. Lorem ipsum dolor sit amet, consectetur adipiscing elit. Sed do eiusmod tempor incididunt ut labore et dolore magna aliqua. Ut enim ad minim veniam, quis nostrud exercitation ullamco laboris nisi ut aliquip ex ea commodo consequat.</w:t>
+      </w:r>
+    </w:p>
+    <w:p>
+      <w:r>
+        <w:t>This is paragraph 5 on page 3. Lorem ipsum dolor sit amet, consectetur adipiscing elit. Sed do eiusmod tempor incididunt ut labore et dolore magna aliqua. Ut enim ad minim veniam, quis nostrud exercitation ullamco laboris nisi ut aliquip ex ea commodo consequat.</w:t>
+      </w:r>
+    </w:p>
+    <w:p>
+      <w:r>
+        <w:t>This is paragraph 6 on page 3. Lorem ipsum dolor sit amet, consectetur adipiscing elit. Sed do eiusmod tempor incididunt ut labore et dolore magna aliqua. Ut enim ad minim veniam, quis nostrud exercitation ullamco laboris nisi ut aliquip ex ea commodo consequat.</w:t>
+      </w:r>
+    </w:p>
+    <w:p>
+      <w:r>
+        <w:t>This is paragraph 7 on page 3. Lorem ipsum dolor sit amet, consectetur adipiscing elit. Sed do eiusmod tempor incididunt ut labore et dolore magna aliqua. Ut enim ad minim veniam, quis nostrud exercitation ullamco laboris nisi ut aliquip ex ea commodo consequat.</w:t>
+      </w:r>
+    </w:p>
+    <w:p>
+      <w:r>
+        <w:t>This is paragraph 8 on page 3. Lorem ipsum dolor sit amet, consectetur adipiscing elit. Sed do eiusmod tempor incididunt ut labore et dolore magna aliqua. Ut enim ad minim veniam, quis nostrud exercitation ullamco laboris nisi ut aliquip ex ea commodo consequat.</w:t>
+      </w:r>
+    </w:p>
+    <w:p>
+      <w:r>
+        <w:t>This is paragraph 9 on page 3. Lorem ipsum dolor sit amet, consectetur adipiscing elit. Sed do eiusmod tempor incididunt ut labore et dolore magna aliqua. Ut enim ad minim veniam, quis nostrud exercitation ullamco laboris nisi ut aliquip ex ea commodo consequat.</w:t>
+      </w:r>
+    </w:p>
+    <w:p>
+      <w:r>
+        <w:br w:type="page"/>
+      </w:r>
+    </w:p>
+    <w:p>
+      <w:r>
+        <w:rPr>
+          <w:b/>
+          <w:sz w:val="48"/>
+        </w:rPr>
+        <w:t>Page 4</w:t>
+      </w:r>
+    </w:p>
+    <w:p>
+      <w:r>
+        <w:t>This is paragraph 1 on page 4. Lorem ipsum dolor sit amet, consectetur adipiscing elit. Sed do eiusmod tempor incididunt ut labore et dolore magna aliqua. Ut enim ad minim veniam, quis nostrud exercitation ullamco laboris nisi ut aliquip ex ea commodo consequat.</w:t>
+      </w:r>
+    </w:p>
+    <w:p>
+      <w:r>
+        <w:t>This is paragraph 2 on page 4. Lorem ipsum dolor sit amet, consectetur adipiscing elit. Sed do eiusmod tempor incididunt ut labore et dolore magna aliqua. Ut enim ad minim veniam, quis nostrud exercitation ullamco laboris nisi ut aliquip ex ea commodo consequat.</w:t>
+      </w:r>
+    </w:p>
+    <w:p>
+      <w:r>
+        <w:t>This is paragraph 3 on page 4. Lorem ipsum dolor sit amet, consectetur adipiscing elit. Sed do eiusmod tempor incididunt ut labore et dolore magna aliqua. Ut enim ad minim veniam, quis nostrud exercitation ullamco laboris nisi ut aliquip ex ea commodo consequat.</w:t>
+      </w:r>
+    </w:p>
+    <w:p>
+      <w:r>
+        <w:t>This is paragraph 4 on page 4. Lorem ipsum dolor sit amet, consectetur adipiscing elit. Sed do eiusmod tempor incididunt ut labore et dolore magna aliqua. Ut enim ad minim veniam, quis nostrud exercitation ullamco laboris nisi ut aliquip ex ea commodo consequat.</w:t>
+      </w:r>
+    </w:p>
+    <w:p>
+      <w:r>
+        <w:t>This is paragraph 5 on page 4. Lorem ipsum dolor sit amet, consectetur adipiscing elit. Sed do eiusmod tempor incididunt ut labore et dolore magna aliqua. Ut enim ad minim veniam, quis nostrud exercitation ullamco laboris nisi ut aliquip ex ea commodo consequat.</w:t>
+      </w:r>
+    </w:p>
+    <w:p>
+      <w:r>
+        <w:t>This is paragraph 6 on page 4. Lorem ipsum dolor sit amet, consectetur adipiscing elit. Sed do eiusmod tempor incididunt ut labore et dolore magna aliqua. Ut enim ad minim veniam, quis nostrud exercitation ullamco laboris nisi ut aliquip ex ea commodo consequat.</w:t>
+      </w:r>
+    </w:p>
+    <w:p>
+      <w:r>
+        <w:t>This is paragraph 7 on page 4. Lorem ipsum dolor sit amet, consectetur adipiscing elit. Sed do eiusmod tempor incididunt ut labore et dolore magna aliqua. Ut enim ad minim veniam, quis nostrud exercitation ullamco laboris nisi ut aliquip ex ea commodo consequat.</w:t>
+      </w:r>
+    </w:p>
+    <w:p>
+      <w:r>
+        <w:t>This is paragraph 8 on page 4. Lorem ipsum dolor sit amet, consectetur adipiscing elit. Sed do eiusmod tempor incididunt ut labore et dolore magna aliqua. Ut enim ad minim veniam, quis nostrud exercitation ullamco laboris nisi ut aliquip ex ea commodo consequat.</w:t>
+      </w:r>
+    </w:p>
+    <w:p>
+      <w:r>
+        <w:t>This is paragraph 9 on page 4. Lorem ipsum dolor sit amet, consectetur adipiscing elit. Sed do eiusmod tempor incididunt ut labore et dolore magna aliqua. Ut enim ad minim veniam, quis nostrud exercitation ullamco laboris nisi ut aliquip ex ea commodo consequat.</w:t>
+      </w:r>
+    </w:p>
     <w:sectPr>
       <w:pgSz w:w="11906" w:h="16838" w:orient="portrait"/>
       <w:pgMar w:top="1440" w:right="1440" w:bottom="1440" w:left="1440" w:header="708" w:footer="708" w:gutter="0"/>

</xml_diff>